<commit_message>
Add full-length RSM manuscript generator and updated submission package
Co-Authored-By: Tatsuki Onishi <bougtoir@gmail.com>
</commit_message>
<xml_diff>
--- a/results/manuscript/rsm_submission/rsm_tables_separate.docx
+++ b/results/manuscript/rsm_submission/rsm_tables_separate.docx
@@ -2,6 +2,17 @@
 <file path=word/document.xml><?xml version="1.0" encoding="utf-8"?>
 <w:document xmlns:wpc="http://schemas.microsoft.com/office/word/2010/wordprocessingCanvas" xmlns:mo="http://schemas.microsoft.com/office/mac/office/2008/main" xmlns:mc="http://schemas.openxmlformats.org/markup-compatibility/2006" xmlns:mv="urn:schemas-microsoft-com:mac:vml" xmlns:o="urn:schemas-microsoft-com:office:office" xmlns:r="http://schemas.openxmlformats.org/officeDocument/2006/relationships" xmlns:m="http://schemas.openxmlformats.org/officeDocument/2006/math" xmlns:v="urn:schemas-microsoft-com:vml" xmlns:wp14="http://schemas.microsoft.com/office/word/2010/wordprocessingDrawing" xmlns:wp="http://schemas.openxmlformats.org/drawingml/2006/wordprocessingDrawing" xmlns:w10="urn:schemas-microsoft-com:office:word" xmlns:w="http://schemas.openxmlformats.org/wordprocessingml/2006/main" xmlns:w14="http://schemas.microsoft.com/office/word/2010/wordml" xmlns:wpg="http://schemas.microsoft.com/office/word/2010/wordprocessingGroup" xmlns:wpi="http://schemas.microsoft.com/office/word/2010/wordprocessingInk" xmlns:wne="http://schemas.microsoft.com/office/word/2006/wordml" xmlns:wps="http://schemas.microsoft.com/office/word/2010/wordprocessingShape" mc:Ignorable="w14 wp14">
   <w:body>
+    <w:p>
+      <w:pPr>
+        <w:jc w:val="center"/>
+      </w:pPr>
+      <w:r>
+        <w:rPr>
+          <w:b/>
+        </w:rPr>
+        <w:t>Table 1. Primary IPD scenario (n=2000, 10 studies, K=5): means over 50 simulations.</w:t>
+      </w:r>
+    </w:p>
     <w:tbl>
       <w:tblPr>
         <w:tblStyle w:val="TableGrid"/>
@@ -1399,6 +1410,7 @@
         </w:tc>
       </w:tr>
     </w:tbl>
+    <w:p/>
     <w:p>
       <w:pPr>
         <w:jc w:val="center"/>
@@ -1407,13 +1419,7 @@
         <w:rPr>
           <w:b/>
         </w:rPr>
-        <w:t>Table 1. Primary IPD scenario (n=2000, 10 studies, K=5): means over 50 simulations.</w:t>
-      </w:r>
-    </w:p>
-    <w:p/>
-    <w:p>
-      <w:r>
-        <w:t>As a comparator, random-effects pooling across the true study identifiers gave an absolute bias of 0.016 (absolute reduction 0.003).</w:t>
+        <w:t>Table 2. Best real-data illustration result per dataset.</w:t>
       </w:r>
     </w:p>
     <w:tbl>
@@ -1885,17 +1891,6 @@
         </w:tc>
       </w:tr>
     </w:tbl>
-    <w:p>
-      <w:pPr>
-        <w:jc w:val="center"/>
-      </w:pPr>
-      <w:r>
-        <w:rPr>
-          <w:b/>
-        </w:rPr>
-        <w:t>Table 2. Best real-data illustration result per dataset.</w:t>
-      </w:r>
-    </w:p>
     <w:p/>
     <w:sectPr>
       <w:pgSz w:w="12240" w:h="15840"/>

</xml_diff>